<commit_message>
ZX81 Emulator. WRX Memory type has been defined. Now it is possible to draw real HR pictures defined in memory RAM using the type of memoty expansion 2 (/w2)
</commit_message>
<xml_diff>
--- a/docs/ZX81Data/ZX81Emulator_UserGuide.docx
+++ b/docs/ZX81Data/ZX81Emulator_UserGuide.docx
@@ -10971,81 +10971,7 @@
         </w:numPr>
       </w:pPr>
       <w:r>
-        <w:t>ZX81 ROM variants, any value other than 0 or 1: reset to unexpanded configuration and logged.</w:t>
-      </w:r>
-    </w:p>
-    <w:p>
-      <w:r>
-        <w:rPr>
-          <w:b/>
-        </w:rPr>
-        <w:t xml:space="preserve">Examples: </w:t>
-      </w:r>
-    </w:p>
-    <w:p>
-      <w:pPr>
-        <w:pStyle w:val="Code"/>
-      </w:pPr>
-      <w:r>
-        <w:t>ZX81Emulator.exe /mZX80 /w0</w:t>
-      </w:r>
-    </w:p>
-    <w:p>
-      <w:pPr>
-        <w:pStyle w:val="Code"/>
-      </w:pPr>
-      <w:r>
-        <w:t>ZX81Emulator.exe /mZX813 /w1</w:t>
-      </w:r>
-    </w:p>
-    <w:p>
-      <w:r>
-        <w:rPr>
-          <w:b/>
-        </w:rPr>
-        <w:t xml:space="preserve">Consequence: </w:t>
-      </w:r>
-      <w:r>
-        <w:t>The selected memory map is installed before the ROM and machine initialize. The broader 3K/8K/24K list in an old header comment is not implemented by the current factory.</w:t>
-      </w:r>
-    </w:p>
-    <w:p>
-      <w:pPr>
-        <w:pStyle w:val="Ttulo1"/>
-        <w:spacing w:before="280"/>
-      </w:pPr>
-      <w:bookmarkStart w:id="16" w:name="_Toc237362880"/>
-      <w:r>
-        <w:lastRenderedPageBreak/>
-        <w:t>/b</w:t>
-      </w:r>
-      <w:bookmarkEnd w:id="16"/>
-    </w:p>
-    <w:p>
-      <w:r>
-        <w:rPr>
-          <w:b/>
-        </w:rPr>
-        <w:t xml:space="preserve">Meaning: </w:t>
-      </w:r>
-      <w:r>
-        <w:t>Draws a diagnostic grid around the writable screen area and selects its color.</w:t>
-      </w:r>
-    </w:p>
-    <w:p>
-      <w:r>
-        <w:rPr>
-          <w:b/>
-        </w:rPr>
-        <w:t xml:space="preserve">General form: </w:t>
-      </w:r>
-    </w:p>
-    <w:p>
-      <w:pPr>
-        <w:pStyle w:val="Code"/>
-      </w:pPr>
-      <w:r>
-        <w:t>/b[COLOR]</w:t>
+        <w:t>ZX81 ROM variants, 2: 16 KiB expansion with refresh-read capability for WRX. Pattern loads use the captured I:R address when it selects the active expansion or its ULA-view mirror. Other addresses retain the existing character path; an undriven refresh bus is not modeled. Full WRX program compatibility remains to be verified.</w:t>
       </w:r>
     </w:p>
     <w:p>
@@ -11057,7 +10983,89 @@
         </w:numPr>
       </w:pPr>
       <w:r>
-        <w:t>COLOR omitted or 0: black (default).</w:t>
+        <w:t>ZX81 ROM variants, any value other than 0, 1 or 2: reset to unexpanded configuration and logged.</w:t>
+      </w:r>
+    </w:p>
+    <w:p>
+      <w:r>
+        <w:rPr>
+          <w:b/>
+        </w:rPr>
+        <w:t xml:space="preserve">Examples: </w:t>
+      </w:r>
+    </w:p>
+    <w:p>
+      <w:pPr>
+        <w:pStyle w:val="Code"/>
+      </w:pPr>
+      <w:r>
+        <w:t>ZX81Emulator.exe /mZX80 /w0</w:t>
+      </w:r>
+    </w:p>
+    <w:p>
+      <w:pPr>
+        <w:pStyle w:val="Code"/>
+      </w:pPr>
+      <w:r>
+        <w:t>ZX81Emulator.exe /mZX813 /w1</w:t>
+      </w:r>
+    </w:p>
+    <w:p>
+      <w:pPr>
+        <w:pStyle w:val="Code"/>
+      </w:pPr>
+      <w:r>
+        <w:t>ZX81Emulator.exe /mZX813 /w2</w:t>
+      </w:r>
+    </w:p>
+    <w:p>
+      <w:r>
+        <w:rPr>
+          <w:b/>
+        </w:rPr>
+        <w:t xml:space="preserve">Consequence: </w:t>
+      </w:r>
+      <w:r>
+        <w:t>The selected memory map is installed before the ROM and machine initialize. The broader 3K/8K/24K list in an old header comment is not implemented by the current factory.</w:t>
+      </w:r>
+    </w:p>
+    <w:p>
+      <w:pPr>
+        <w:pStyle w:val="Ttulo1"/>
+        <w:spacing w:before="280"/>
+      </w:pPr>
+      <w:bookmarkStart w:id="16" w:name="_Toc237362880"/>
+      <w:r>
+        <w:lastRenderedPageBreak/>
+        <w:t>/b</w:t>
+      </w:r>
+      <w:bookmarkEnd w:id="16"/>
+    </w:p>
+    <w:p>
+      <w:r>
+        <w:rPr>
+          <w:b/>
+        </w:rPr>
+        <w:t xml:space="preserve">Meaning: </w:t>
+      </w:r>
+      <w:r>
+        <w:t>Draws a diagnostic grid around the writable screen area and selects its color.</w:t>
+      </w:r>
+    </w:p>
+    <w:p>
+      <w:r>
+        <w:rPr>
+          <w:b/>
+        </w:rPr>
+        <w:t xml:space="preserve">General form: </w:t>
+      </w:r>
+    </w:p>
+    <w:p>
+      <w:pPr>
+        <w:pStyle w:val="Code"/>
+      </w:pPr>
+      <w:r>
+        <w:t>/b[COLOR]</w:t>
       </w:r>
     </w:p>
     <w:p>
@@ -11069,7 +11077,7 @@
         </w:numPr>
       </w:pPr>
       <w:r>
-        <w:t>1 through 15: the requested grid color.</w:t>
+        <w:t>COLOR omitted or 0: black (default).</w:t>
       </w:r>
     </w:p>
     <w:p>
@@ -11081,80 +11089,7 @@
         </w:numPr>
       </w:pPr>
       <w:r>
-        <w:t>Any value greater than 15: clamped to 15.</w:t>
-      </w:r>
-    </w:p>
-    <w:p>
-      <w:r>
-        <w:rPr>
-          <w:b/>
-        </w:rPr>
-        <w:t xml:space="preserve">Examples: </w:t>
-      </w:r>
-    </w:p>
-    <w:p>
-      <w:pPr>
-        <w:pStyle w:val="Code"/>
-      </w:pPr>
-      <w:r>
-        <w:t>ZX81Emulator.exe /b</w:t>
-      </w:r>
-    </w:p>
-    <w:p>
-      <w:pPr>
-        <w:pStyle w:val="Code"/>
-      </w:pPr>
-      <w:r>
-        <w:t>ZX81Emulator.exe /b14</w:t>
-      </w:r>
-    </w:p>
-    <w:p>
-      <w:r>
-        <w:rPr>
-          <w:b/>
-        </w:rPr>
-        <w:t xml:space="preserve">Consequence: </w:t>
-      </w:r>
-      <w:r>
-        <w:t>The screen is initialized with the diagnostic grid enabled in the selected color.</w:t>
-      </w:r>
-    </w:p>
-    <w:p>
-      <w:pPr>
-        <w:pStyle w:val="Ttulo1"/>
-        <w:spacing w:before="280"/>
-      </w:pPr>
-      <w:bookmarkStart w:id="17" w:name="_Toc237362881"/>
-      <w:r>
-        <w:t>/m</w:t>
-      </w:r>
-      <w:bookmarkEnd w:id="17"/>
-    </w:p>
-    <w:p>
-      <w:r>
-        <w:rPr>
-          <w:b/>
-        </w:rPr>
-        <w:t xml:space="preserve">Meaning: </w:t>
-      </w:r>
-      <w:r>
-        <w:t>Selects the ZX80 or ZX81 ROM variant to emulate.</w:t>
-      </w:r>
-    </w:p>
-    <w:p>
-      <w:r>
-        <w:rPr>
-          <w:b/>
-        </w:rPr>
-        <w:t xml:space="preserve">General form: </w:t>
-      </w:r>
-    </w:p>
-    <w:p>
-      <w:pPr>
-        <w:pStyle w:val="Code"/>
-      </w:pPr>
-      <w:r>
-        <w:t>/mMACHINE</w:t>
+        <w:t>1 through 15: the requested grid color.</w:t>
       </w:r>
     </w:p>
     <w:p>
@@ -11166,7 +11101,80 @@
         </w:numPr>
       </w:pPr>
       <w:r>
-        <w:t>ZX80: ZX80 model and ROM; this is the default when /m is omitted.</w:t>
+        <w:t>Any value greater than 15: clamped to 15.</w:t>
+      </w:r>
+    </w:p>
+    <w:p>
+      <w:r>
+        <w:rPr>
+          <w:b/>
+        </w:rPr>
+        <w:t xml:space="preserve">Examples: </w:t>
+      </w:r>
+    </w:p>
+    <w:p>
+      <w:pPr>
+        <w:pStyle w:val="Code"/>
+      </w:pPr>
+      <w:r>
+        <w:t>ZX81Emulator.exe /b</w:t>
+      </w:r>
+    </w:p>
+    <w:p>
+      <w:pPr>
+        <w:pStyle w:val="Code"/>
+      </w:pPr>
+      <w:r>
+        <w:t>ZX81Emulator.exe /b14</w:t>
+      </w:r>
+    </w:p>
+    <w:p>
+      <w:r>
+        <w:rPr>
+          <w:b/>
+        </w:rPr>
+        <w:t xml:space="preserve">Consequence: </w:t>
+      </w:r>
+      <w:r>
+        <w:t>The screen is initialized with the diagnostic grid enabled in the selected color.</w:t>
+      </w:r>
+    </w:p>
+    <w:p>
+      <w:pPr>
+        <w:pStyle w:val="Ttulo1"/>
+        <w:spacing w:before="280"/>
+      </w:pPr>
+      <w:bookmarkStart w:id="17" w:name="_Toc237362881"/>
+      <w:r>
+        <w:t>/m</w:t>
+      </w:r>
+      <w:bookmarkEnd w:id="17"/>
+    </w:p>
+    <w:p>
+      <w:r>
+        <w:rPr>
+          <w:b/>
+        </w:rPr>
+        <w:t xml:space="preserve">Meaning: </w:t>
+      </w:r>
+      <w:r>
+        <w:t>Selects the ZX80 or ZX81 ROM variant to emulate.</w:t>
+      </w:r>
+    </w:p>
+    <w:p>
+      <w:r>
+        <w:rPr>
+          <w:b/>
+        </w:rPr>
+        <w:t xml:space="preserve">General form: </w:t>
+      </w:r>
+    </w:p>
+    <w:p>
+      <w:pPr>
+        <w:pStyle w:val="Code"/>
+      </w:pPr>
+      <w:r>
+        <w:t>/mMACHINE</w:t>
       </w:r>
     </w:p>
     <w:p>
@@ -11178,7 +11186,7 @@
         </w:numPr>
       </w:pPr>
       <w:r>
-        <w:t>ZX811: ZX81 with the old ROM image.</w:t>
+        <w:t>ZX80: ZX80 model and ROM; this is the default when /m is omitted.</w:t>
       </w:r>
     </w:p>
     <w:p>
@@ -11190,7 +11198,7 @@
         </w:numPr>
       </w:pPr>
       <w:r>
-        <w:t>ZX812: ZX81 with the rare/intermediate ROM image.</w:t>
+        <w:t>ZX811: ZX81 with the old ROM image.</w:t>
       </w:r>
     </w:p>
     <w:p>
@@ -11202,7 +11210,7 @@
         </w:numPr>
       </w:pPr>
       <w:r>
-        <w:t>ZX813: ZX81 with the newest ROM image.</w:t>
+        <w:t>ZX812: ZX81 with the rare/intermediate ROM image.</w:t>
       </w:r>
     </w:p>
     <w:p>
@@ -11214,103 +11222,7 @@
         </w:numPr>
       </w:pPr>
       <w:r>
-        <w:t>Any other value: logs the unsupported selector and falls back to ZX80.</w:t>
-      </w:r>
-    </w:p>
-    <w:p>
-      <w:r>
-        <w:rPr>
-          <w:b/>
-        </w:rPr>
-        <w:t xml:space="preserve">Examples: </w:t>
-      </w:r>
-    </w:p>
-    <w:p>
-      <w:pPr>
-        <w:pStyle w:val="Code"/>
-      </w:pPr>
-      <w:r>
-        <w:t>ZX81Emulator.exe /mZX80</w:t>
-      </w:r>
-    </w:p>
-    <w:p>
-      <w:pPr>
-        <w:pStyle w:val="Code"/>
-      </w:pPr>
-      <w:r>
-        <w:t>ZX81Emulator.exe /mZX811</w:t>
-      </w:r>
-    </w:p>
-    <w:p>
-      <w:pPr>
-        <w:pStyle w:val="Code"/>
-      </w:pPr>
-      <w:r>
-        <w:t>ZX81Emulator.exe /mZX813 /w1</w:t>
-      </w:r>
-    </w:p>
-    <w:p>
-      <w:r>
-        <w:rPr>
-          <w:b/>
-        </w:rPr>
-        <w:t xml:space="preserve">Consequence: </w:t>
-      </w:r>
-      <w:r>
-        <w:t>The selector chooses the ROM image and machine type created before initialization. It does not independently select a ULA silicon revision, video standard or RAM expansion.</w:t>
-      </w:r>
-    </w:p>
-    <w:p>
-      <w:pPr>
-        <w:pStyle w:val="Ttulo"/>
-      </w:pPr>
-      <w:r>
-        <w:lastRenderedPageBreak/>
-        <w:t>2. Startup Parameters: Version With a Local Console</w:t>
-      </w:r>
-    </w:p>
-    <w:p>
-      <w:r>
-        <w:t>Executable: ZX81EmulatorC.exe. Its main program delegates the complete command line to ZX81::ZX81Emulator, so all inherited framework options and ZX80/ZX81-specific options are active even though the short main-level help banner only advertises /h. It has no /o listener option; commands are entered in its local console.</w:t>
-      </w:r>
-    </w:p>
-    <w:p>
-      <w:pPr>
-        <w:pStyle w:val="Ttulo1"/>
-        <w:spacing w:before="280"/>
-      </w:pPr>
-      <w:bookmarkStart w:id="18" w:name="_Toc237362882"/>
-      <w:r>
-        <w:t>/h</w:t>
-      </w:r>
-      <w:bookmarkEnd w:id="18"/>
-    </w:p>
-    <w:p>
-      <w:r>
-        <w:rPr>
-          <w:b/>
-        </w:rPr>
-        <w:t xml:space="preserve">Meaning: </w:t>
-      </w:r>
-      <w:r>
-        <w:t>Prints the executable help and prevents the emulation from starting.</w:t>
-      </w:r>
-    </w:p>
-    <w:p>
-      <w:r>
-        <w:rPr>
-          <w:b/>
-        </w:rPr>
-        <w:t xml:space="preserve">General form: </w:t>
-      </w:r>
-    </w:p>
-    <w:p>
-      <w:pPr>
-        <w:pStyle w:val="Code"/>
-        <w:keepLines/>
-      </w:pPr>
-      <w:r>
-        <w:t>/h</w:t>
+        <w:t>ZX813: ZX81 with the newest ROM image.</w:t>
       </w:r>
     </w:p>
     <w:p>
@@ -11322,7 +11234,7 @@
         </w:numPr>
       </w:pPr>
       <w:r>
-        <w:t>No value.</w:t>
+        <w:t>Any other value: logs the unsupported selector and falls back to ZX80.</w:t>
       </w:r>
     </w:p>
     <w:p>
@@ -11331,6 +11243,93 @@
           <w:b/>
         </w:rPr>
         <w:t xml:space="preserve">Examples: </w:t>
+      </w:r>
+    </w:p>
+    <w:p>
+      <w:pPr>
+        <w:pStyle w:val="Code"/>
+      </w:pPr>
+      <w:r>
+        <w:t>ZX81Emulator.exe /mZX80</w:t>
+      </w:r>
+    </w:p>
+    <w:p>
+      <w:pPr>
+        <w:pStyle w:val="Code"/>
+      </w:pPr>
+      <w:r>
+        <w:t>ZX81Emulator.exe /mZX811</w:t>
+      </w:r>
+    </w:p>
+    <w:p>
+      <w:pPr>
+        <w:pStyle w:val="Code"/>
+      </w:pPr>
+      <w:r>
+        <w:t>ZX81Emulator.exe /mZX813 /w1</w:t>
+      </w:r>
+    </w:p>
+    <w:p>
+      <w:pPr>
+        <w:pStyle w:val="Code"/>
+      </w:pPr>
+      <w:r>
+        <w:t>ZX81Emulator.exe /mZX813 /w2</w:t>
+      </w:r>
+    </w:p>
+    <w:p>
+      <w:r>
+        <w:rPr>
+          <w:b/>
+        </w:rPr>
+        <w:t xml:space="preserve">Consequence: </w:t>
+      </w:r>
+      <w:r>
+        <w:t>The selector chooses the ROM image and machine type created before initialization. It does not independently select a ULA silicon revision, video standard or RAM expansion.</w:t>
+      </w:r>
+    </w:p>
+    <w:p>
+      <w:pPr>
+        <w:pStyle w:val="Ttulo"/>
+      </w:pPr>
+      <w:r>
+        <w:lastRenderedPageBreak/>
+        <w:t>2. Startup Parameters: Version With a Local Console</w:t>
+      </w:r>
+    </w:p>
+    <w:p>
+      <w:r>
+        <w:t>Executable: ZX81EmulatorC.exe. Its main program delegates the complete command line to ZX81::ZX81Emulator, so all inherited framework options and ZX80/ZX81-specific options are active even though the short main-level help banner only advertises /h. It has no /o listener option; commands are entered in its local console.</w:t>
+      </w:r>
+    </w:p>
+    <w:p>
+      <w:pPr>
+        <w:pStyle w:val="Ttulo1"/>
+        <w:spacing w:before="280"/>
+      </w:pPr>
+      <w:bookmarkStart w:id="18" w:name="_Toc237362882"/>
+      <w:r>
+        <w:t>/h</w:t>
+      </w:r>
+      <w:bookmarkEnd w:id="18"/>
+    </w:p>
+    <w:p>
+      <w:r>
+        <w:rPr>
+          <w:b/>
+        </w:rPr>
+        <w:t xml:space="preserve">Meaning: </w:t>
+      </w:r>
+      <w:r>
+        <w:t>Prints the executable help and prevents the emulation from starting.</w:t>
+      </w:r>
+    </w:p>
+    <w:p>
+      <w:r>
+        <w:rPr>
+          <w:b/>
+        </w:rPr>
+        <w:t xml:space="preserve">General form: </w:t>
       </w:r>
     </w:p>
     <w:p>
@@ -11339,57 +11338,7 @@
         <w:keepLines/>
       </w:pPr>
       <w:r>
-        <w:t>ZX81EmulatorC.exe /h</w:t>
-      </w:r>
-    </w:p>
-    <w:p>
-      <w:r>
-        <w:rPr>
-          <w:b/>
-        </w:rPr>
-        <w:t xml:space="preserve">Consequence: </w:t>
-      </w:r>
-      <w:r>
-        <w:t>Initialization returns failure after printing the help; the current main program therefore exits with code 1.</w:t>
-      </w:r>
-    </w:p>
-    <w:p>
-      <w:pPr>
-        <w:pStyle w:val="Ttulo1"/>
-        <w:spacing w:before="280"/>
-      </w:pPr>
-      <w:bookmarkStart w:id="19" w:name="_Toc237362883"/>
-      <w:r>
-        <w:t>/f</w:t>
-      </w:r>
-      <w:bookmarkEnd w:id="19"/>
-    </w:p>
-    <w:p>
-      <w:r>
-        <w:rPr>
-          <w:b/>
-        </w:rPr>
-        <w:t xml:space="preserve">Meaning: </w:t>
-      </w:r>
-      <w:r>
-        <w:t>Loads a binary file whose header contains the destination address.</w:t>
-      </w:r>
-    </w:p>
-    <w:p>
-      <w:r>
-        <w:rPr>
-          <w:b/>
-        </w:rPr>
-        <w:t xml:space="preserve">General form: </w:t>
-      </w:r>
-    </w:p>
-    <w:p>
-      <w:pPr>
-        <w:pStyle w:val="Code"/>
-        <w:keepLines/>
-      </w:pPr>
-      <w:r>
-        <w:t>/fFILE</w:t>
+        <w:t>/h</w:t>
       </w:r>
     </w:p>
     <w:p>
@@ -11401,7 +11350,7 @@
         </w:numPr>
       </w:pPr>
       <w:r>
-        <w:t>FILE: path to the header-addressed binary file; attach it directly to /f.</w:t>
+        <w:t>No value.</w:t>
       </w:r>
     </w:p>
     <w:p>
@@ -11418,7 +11367,48 @@
         <w:keepLines/>
       </w:pPr>
       <w:r>
-        <w:t>ZX81EmulatorC.exe /fprogram.bin</w:t>
+        <w:t>ZX81EmulatorC.exe /h</w:t>
+      </w:r>
+    </w:p>
+    <w:p>
+      <w:r>
+        <w:rPr>
+          <w:b/>
+        </w:rPr>
+        <w:t xml:space="preserve">Consequence: </w:t>
+      </w:r>
+      <w:r>
+        <w:t>Initialization returns failure after printing the help; the current main program therefore exits with code 1.</w:t>
+      </w:r>
+    </w:p>
+    <w:p>
+      <w:pPr>
+        <w:pStyle w:val="Ttulo1"/>
+        <w:spacing w:before="280"/>
+      </w:pPr>
+      <w:bookmarkStart w:id="19" w:name="_Toc237362883"/>
+      <w:r>
+        <w:t>/f</w:t>
+      </w:r>
+      <w:bookmarkEnd w:id="19"/>
+    </w:p>
+    <w:p>
+      <w:r>
+        <w:rPr>
+          <w:b/>
+        </w:rPr>
+        <w:t xml:space="preserve">Meaning: </w:t>
+      </w:r>
+      <w:r>
+        <w:t>Loads a binary file whose header contains the destination address.</w:t>
+      </w:r>
+    </w:p>
+    <w:p>
+      <w:r>
+        <w:rPr>
+          <w:b/>
+        </w:rPr>
+        <w:t xml:space="preserve">General form: </w:t>
       </w:r>
     </w:p>
     <w:p>
@@ -11427,57 +11417,7 @@
         <w:keepLines/>
       </w:pPr>
       <w:r>
-        <w:t>ZX81EmulatorC.exe /fgames\demo.bin /a$080d</w:t>
-      </w:r>
-    </w:p>
-    <w:p>
-      <w:r>
-        <w:rPr>
-          <w:b/>
-        </w:rPr>
-        <w:t xml:space="preserve">Consequence: </w:t>
-      </w:r>
-      <w:r>
-        <w:t>The file is loaded before execution. An unreadable or invalid file aborts initialization.</w:t>
-      </w:r>
-    </w:p>
-    <w:p>
-      <w:pPr>
-        <w:pStyle w:val="Ttulo1"/>
-        <w:spacing w:before="280"/>
-      </w:pPr>
-      <w:bookmarkStart w:id="20" w:name="_Toc237362884"/>
-      <w:r>
-        <w:t>/k</w:t>
-      </w:r>
-      <w:bookmarkEnd w:id="20"/>
-    </w:p>
-    <w:p>
-      <w:r>
-        <w:rPr>
-          <w:b/>
-        </w:rPr>
-        <w:t xml:space="preserve">Meaning: </w:t>
-      </w:r>
-      <w:r>
-        <w:t>Loads a block-structured memory file.</w:t>
-      </w:r>
-    </w:p>
-    <w:p>
-      <w:r>
-        <w:rPr>
-          <w:b/>
-        </w:rPr>
-        <w:t xml:space="preserve">General form: </w:t>
-      </w:r>
-    </w:p>
-    <w:p>
-      <w:pPr>
-        <w:pStyle w:val="Code"/>
-        <w:keepLines/>
-      </w:pPr>
-      <w:r>
-        <w:t>/kFILE</w:t>
+        <w:t>/fFILE</w:t>
       </w:r>
     </w:p>
     <w:p>
@@ -11489,7 +11429,7 @@
         </w:numPr>
       </w:pPr>
       <w:r>
-        <w:t>FILE: path to a block file understood by the framework.</w:t>
+        <w:t>FILE: path to the header-addressed binary file; attach it directly to /f.</w:t>
       </w:r>
     </w:p>
     <w:p>
@@ -11506,19 +11446,27 @@
         <w:keepLines/>
       </w:pPr>
       <w:r>
-        <w:t>ZX81EmulatorC.exe /ksnapshot.blocks</w:t>
-      </w:r>
-    </w:p>
-    <w:p>
-      <w:r>
-        <w:rPr>
-          <w:b/>
-        </w:rPr>
-        <w:lastRenderedPageBreak/>
+        <w:t>ZX81EmulatorC.exe /fprogram.bin</w:t>
+      </w:r>
+    </w:p>
+    <w:p>
+      <w:pPr>
+        <w:pStyle w:val="Code"/>
+        <w:keepLines/>
+      </w:pPr>
+      <w:r>
+        <w:t>ZX81EmulatorC.exe /fgames\demo.bin /a$080d</w:t>
+      </w:r>
+    </w:p>
+    <w:p>
+      <w:r>
+        <w:rPr>
+          <w:b/>
+        </w:rPr>
         <w:t xml:space="preserve">Consequence: </w:t>
       </w:r>
       <w:r>
-        <w:t>Every encoded block is placed at its stored address. A load error aborts initialization.</w:t>
+        <w:t>The file is loaded before execution. An unreadable or invalid file aborts initialization.</w:t>
       </w:r>
     </w:p>
     <w:p>
@@ -11526,11 +11474,11 @@
         <w:pStyle w:val="Ttulo1"/>
         <w:spacing w:before="280"/>
       </w:pPr>
-      <w:bookmarkStart w:id="21" w:name="_Toc237362885"/>
-      <w:r>
-        <w:t>/c</w:t>
-      </w:r>
-      <w:bookmarkEnd w:id="21"/>
+      <w:bookmarkStart w:id="20" w:name="_Toc237362884"/>
+      <w:r>
+        <w:t>/k</w:t>
+      </w:r>
+      <w:bookmarkEnd w:id="20"/>
     </w:p>
     <w:p>
       <w:r>
@@ -11540,7 +11488,7 @@
         <w:t xml:space="preserve">Meaning: </w:t>
       </w:r>
       <w:r>
-        <w:t>Parses, assembles and loads an assembler source file.</w:t>
+        <w:t>Loads a block-structured memory file.</w:t>
       </w:r>
     </w:p>
     <w:p>
@@ -11557,7 +11505,7 @@
         <w:keepLines/>
       </w:pPr>
       <w:r>
-        <w:t>/cFILE</w:t>
+        <w:t>/kFILE</w:t>
       </w:r>
     </w:p>
     <w:p>
@@ -11569,7 +11517,7 @@
         </w:numPr>
       </w:pPr>
       <w:r>
-        <w:t>FILE: assembler source path.</w:t>
+        <w:t>FILE: path to a block file understood by the framework.</w:t>
       </w:r>
     </w:p>
     <w:p>
@@ -11586,18 +11534,19 @@
         <w:keepLines/>
       </w:pPr>
       <w:r>
-        <w:t>ZX81EmulatorC.exe /cstartup.asm /s</w:t>
-      </w:r>
-    </w:p>
-    <w:p>
-      <w:r>
-        <w:rPr>
-          <w:b/>
-        </w:rPr>
+        <w:t>ZX81EmulatorC.exe /ksnapshot.blocks</w:t>
+      </w:r>
+    </w:p>
+    <w:p>
+      <w:r>
+        <w:rPr>
+          <w:b/>
+        </w:rPr>
+        <w:lastRenderedPageBreak/>
         <w:t xml:space="preserve">Consequence: </w:t>
       </w:r>
       <w:r>
-        <w:t>The assembled bytes are installed before the main loop. Syntax or load errors are logged and initialization stops.</w:t>
+        <w:t>Every encoded block is placed at its stored address. A load error aborts initialization.</w:t>
       </w:r>
     </w:p>
     <w:p>
@@ -11605,11 +11554,11 @@
         <w:pStyle w:val="Ttulo1"/>
         <w:spacing w:before="280"/>
       </w:pPr>
-      <w:bookmarkStart w:id="22" w:name="_Toc237362886"/>
-      <w:r>
-        <w:t>/l</w:t>
-      </w:r>
-      <w:bookmarkEnd w:id="22"/>
+      <w:bookmarkStart w:id="21" w:name="_Toc237362885"/>
+      <w:r>
+        <w:t>/c</w:t>
+      </w:r>
+      <w:bookmarkEnd w:id="21"/>
     </w:p>
     <w:p>
       <w:r>
@@ -11619,7 +11568,7 @@
         <w:t xml:space="preserve">Meaning: </w:t>
       </w:r>
       <w:r>
-        <w:t>Selects the framework diagnostic level.</w:t>
+        <w:t>Parses, assembles and loads an assembler source file.</w:t>
       </w:r>
     </w:p>
     <w:p>
@@ -11636,7 +11585,7 @@
         <w:keepLines/>
       </w:pPr>
       <w:r>
-        <w:t>/lLEVEL</w:t>
+        <w:t>/cFILE</w:t>
       </w:r>
     </w:p>
     <w:p>
@@ -11648,7 +11597,74 @@
         </w:numPr>
       </w:pPr>
       <w:r>
-        <w:t>0: no diagnostics.</w:t>
+        <w:t>FILE: assembler source path.</w:t>
+      </w:r>
+    </w:p>
+    <w:p>
+      <w:r>
+        <w:rPr>
+          <w:b/>
+        </w:rPr>
+        <w:t xml:space="preserve">Examples: </w:t>
+      </w:r>
+    </w:p>
+    <w:p>
+      <w:pPr>
+        <w:pStyle w:val="Code"/>
+        <w:keepLines/>
+      </w:pPr>
+      <w:r>
+        <w:t>ZX81EmulatorC.exe /cstartup.asm /s</w:t>
+      </w:r>
+    </w:p>
+    <w:p>
+      <w:r>
+        <w:rPr>
+          <w:b/>
+        </w:rPr>
+        <w:t xml:space="preserve">Consequence: </w:t>
+      </w:r>
+      <w:r>
+        <w:t>The assembled bytes are installed before the main loop. Syntax or load errors are logged and initialization stops.</w:t>
+      </w:r>
+    </w:p>
+    <w:p>
+      <w:pPr>
+        <w:pStyle w:val="Ttulo1"/>
+        <w:spacing w:before="280"/>
+      </w:pPr>
+      <w:bookmarkStart w:id="22" w:name="_Toc237362886"/>
+      <w:r>
+        <w:t>/l</w:t>
+      </w:r>
+      <w:bookmarkEnd w:id="22"/>
+    </w:p>
+    <w:p>
+      <w:r>
+        <w:rPr>
+          <w:b/>
+        </w:rPr>
+        <w:t xml:space="preserve">Meaning: </w:t>
+      </w:r>
+      <w:r>
+        <w:t>Selects the framework diagnostic level.</w:t>
+      </w:r>
+    </w:p>
+    <w:p>
+      <w:r>
+        <w:rPr>
+          <w:b/>
+        </w:rPr>
+        <w:t xml:space="preserve">General form: </w:t>
+      </w:r>
+    </w:p>
+    <w:p>
+      <w:pPr>
+        <w:pStyle w:val="Code"/>
+        <w:keepLines/>
+      </w:pPr>
+      <w:r>
+        <w:t>/lLEVEL</w:t>
       </w:r>
     </w:p>
     <w:p>
@@ -11660,7 +11676,7 @@
         </w:numPr>
       </w:pPr>
       <w:r>
-        <w:t>1: errors (default).</w:t>
+        <w:t>0: no diagnostics.</w:t>
       </w:r>
     </w:p>
     <w:p>
@@ -11672,7 +11688,7 @@
         </w:numPr>
       </w:pPr>
       <w:r>
-        <w:t>2: dump at exit.</w:t>
+        <w:t>1: errors (default).</w:t>
       </w:r>
     </w:p>
     <w:p>
@@ -11684,7 +11700,7 @@
         </w:numPr>
       </w:pPr>
       <w:r>
-        <w:t>3: errors and warnings.</w:t>
+        <w:t>2: dump at exit.</w:t>
       </w:r>
     </w:p>
     <w:p>
@@ -11696,7 +11712,7 @@
         </w:numPr>
       </w:pPr>
       <w:r>
-        <w:t>4: all regular diagnostics.</w:t>
+        <w:t>3: errors and warnings.</w:t>
       </w:r>
     </w:p>
     <w:p>
@@ -11708,83 +11724,7 @@
         </w:numPr>
       </w:pPr>
       <w:r>
-        <w:t>5: internal trace diagnostics.</w:t>
-      </w:r>
-    </w:p>
-    <w:p>
-      <w:r>
-        <w:rPr>
-          <w:b/>
-        </w:rPr>
-        <w:t xml:space="preserve">Examples: </w:t>
-      </w:r>
-    </w:p>
-    <w:p>
-      <w:pPr>
-        <w:pStyle w:val="Code"/>
-        <w:keepLines/>
-      </w:pPr>
-      <w:r>
-        <w:t>ZX81EmulatorC.exe /l0</w:t>
-      </w:r>
-    </w:p>
-    <w:p>
-      <w:pPr>
-        <w:pStyle w:val="Code"/>
-        <w:keepLines/>
-      </w:pPr>
-      <w:r>
-        <w:t>ZX81EmulatorC.exe /l4</w:t>
-      </w:r>
-    </w:p>
-    <w:p>
-      <w:r>
-        <w:rPr>
-          <w:b/>
-        </w:rPr>
-        <w:t xml:space="preserve">Consequence: </w:t>
-      </w:r>
-      <w:r>
-        <w:t>Higher values produce progressively more diagnostic output and may reduce performance.</w:t>
-      </w:r>
-    </w:p>
-    <w:p>
-      <w:pPr>
-        <w:pStyle w:val="Ttulo1"/>
-        <w:spacing w:before="280"/>
-      </w:pPr>
-      <w:bookmarkStart w:id="23" w:name="_Toc237362887"/>
-      <w:r>
-        <w:t>/a</w:t>
-      </w:r>
-      <w:bookmarkEnd w:id="23"/>
-    </w:p>
-    <w:p>
-      <w:r>
-        <w:rPr>
-          <w:b/>
-        </w:rPr>
-        <w:t xml:space="preserve">Meaning: </w:t>
-      </w:r>
-      <w:r>
-        <w:t>Overrides the address at which execution begins.</w:t>
-      </w:r>
-    </w:p>
-    <w:p>
-      <w:r>
-        <w:rPr>
-          <w:b/>
-        </w:rPr>
-        <w:t xml:space="preserve">General form: </w:t>
-      </w:r>
-    </w:p>
-    <w:p>
-      <w:pPr>
-        <w:pStyle w:val="Code"/>
-        <w:keepLines/>
-      </w:pPr>
-      <w:r>
-        <w:t>/aADDRESS</w:t>
+        <w:t>4: all regular diagnostics.</w:t>
       </w:r>
     </w:p>
     <w:p>
@@ -11796,7 +11736,7 @@
         </w:numPr>
       </w:pPr>
       <w:r>
-        <w:t>ADDRESS: ZX80/ZX81 address in the framework number syntax, for example decimal or hexadecimal with $.</w:t>
+        <w:t>5: internal trace diagnostics.</w:t>
       </w:r>
     </w:p>
     <w:p>
@@ -11813,7 +11753,7 @@
         <w:keepLines/>
       </w:pPr>
       <w:r>
-        <w:t>ZX81EmulatorC.exe /a$080d</w:t>
+        <w:t>ZX81EmulatorC.exe /l0</w:t>
       </w:r>
     </w:p>
     <w:p>
@@ -11822,7 +11762,7 @@
         <w:keepLines/>
       </w:pPr>
       <w:r>
-        <w:t>ZX81EmulatorC.exe /fprogram.bin /a2061</w:t>
+        <w:t>ZX81EmulatorC.exe /l4</w:t>
       </w:r>
     </w:p>
     <w:p>
@@ -11833,7 +11773,7 @@
         <w:t xml:space="preserve">Consequence: </w:t>
       </w:r>
       <w:r>
-        <w:t>A non-zero, valid address replaces the normal reset/program entry address.</w:t>
+        <w:t>Higher values produce progressively more diagnostic output and may reduce performance.</w:t>
       </w:r>
     </w:p>
     <w:p>
@@ -11841,12 +11781,11 @@
         <w:pStyle w:val="Ttulo1"/>
         <w:spacing w:before="280"/>
       </w:pPr>
-      <w:bookmarkStart w:id="24" w:name="_Toc237362888"/>
-      <w:r>
-        <w:lastRenderedPageBreak/>
-        <w:t>/d</w:t>
-      </w:r>
-      <w:bookmarkEnd w:id="24"/>
+      <w:bookmarkStart w:id="23" w:name="_Toc237362887"/>
+      <w:r>
+        <w:t>/a</w:t>
+      </w:r>
+      <w:bookmarkEnd w:id="23"/>
     </w:p>
     <w:p>
       <w:r>
@@ -11856,7 +11795,7 @@
         <w:t xml:space="preserve">Meaning: </w:t>
       </w:r>
       <w:r>
-        <w:t>Creates startup stop points at one or more addresses.</w:t>
+        <w:t>Overrides the address at which execution begins.</w:t>
       </w:r>
     </w:p>
     <w:p>
@@ -11873,7 +11812,7 @@
         <w:keepLines/>
       </w:pPr>
       <w:r>
-        <w:t>/dADDRESS1,ADDRESS2,...</w:t>
+        <w:t>/aADDRESS</w:t>
       </w:r>
     </w:p>
     <w:p>
@@ -11885,7 +11824,7 @@
         </w:numPr>
       </w:pPr>
       <w:r>
-        <w:t>ADDRESSn: comma-separated address. Each entry accepts the framework number syntax.</w:t>
+        <w:t>ADDRESS: ZX80/ZX81 address in the framework number syntax, for example decimal or hexadecimal with $.</w:t>
       </w:r>
     </w:p>
     <w:p>
@@ -11902,7 +11841,7 @@
         <w:keepLines/>
       </w:pPr>
       <w:r>
-        <w:t>ZX81EmulatorC.exe /d$080d</w:t>
+        <w:t>ZX81EmulatorC.exe /a$080d</w:t>
       </w:r>
     </w:p>
     <w:p>
@@ -11911,7 +11850,7 @@
         <w:keepLines/>
       </w:pPr>
       <w:r>
-        <w:t>ZX81EmulatorC.exe /d$080d,$ffd2 /s</w:t>
+        <w:t>ZX81EmulatorC.exe /fprogram.bin /a2061</w:t>
       </w:r>
     </w:p>
     <w:p>
@@ -11922,7 +11861,7 @@
         <w:t xml:space="preserve">Consequence: </w:t>
       </w:r>
       <w:r>
-        <w:t>Execution stops when the CPU reaches any listed address, allowing later inspection or continuation.</w:t>
+        <w:t>A non-zero, valid address replaces the normal reset/program entry address.</w:t>
       </w:r>
     </w:p>
     <w:p>
@@ -11930,11 +11869,12 @@
         <w:pStyle w:val="Ttulo1"/>
         <w:spacing w:before="280"/>
       </w:pPr>
-      <w:bookmarkStart w:id="25" w:name="_Toc237362889"/>
-      <w:r>
-        <w:t>/s</w:t>
-      </w:r>
-      <w:bookmarkEnd w:id="25"/>
+      <w:bookmarkStart w:id="24" w:name="_Toc237362888"/>
+      <w:r>
+        <w:lastRenderedPageBreak/>
+        <w:t>/d</w:t>
+      </w:r>
+      <w:bookmarkEnd w:id="24"/>
     </w:p>
     <w:p>
       <w:r>
@@ -11944,7 +11884,7 @@
         <w:t xml:space="preserve">Meaning: </w:t>
       </w:r>
       <w:r>
-        <w:t>Controls whether the emulated computer starts stopped.</w:t>
+        <w:t>Creates startup stop points at one or more addresses.</w:t>
       </w:r>
     </w:p>
     <w:p>
@@ -11961,7 +11901,7 @@
         <w:keepLines/>
       </w:pPr>
       <w:r>
-        <w:t>/s[YES|NO]</w:t>
+        <w:t>/dADDRESS1,ADDRESS2,...</w:t>
       </w:r>
     </w:p>
     <w:p>
@@ -11973,7 +11913,83 @@
         </w:numPr>
       </w:pPr>
       <w:r>
-        <w:t>YES or an empty value: start stopped.</w:t>
+        <w:t>ADDRESSn: comma-separated address. Each entry accepts the framework number syntax.</w:t>
+      </w:r>
+    </w:p>
+    <w:p>
+      <w:r>
+        <w:rPr>
+          <w:b/>
+        </w:rPr>
+        <w:t xml:space="preserve">Examples: </w:t>
+      </w:r>
+    </w:p>
+    <w:p>
+      <w:pPr>
+        <w:pStyle w:val="Code"/>
+        <w:keepLines/>
+      </w:pPr>
+      <w:r>
+        <w:t>ZX81EmulatorC.exe /d$080d</w:t>
+      </w:r>
+    </w:p>
+    <w:p>
+      <w:pPr>
+        <w:pStyle w:val="Code"/>
+        <w:keepLines/>
+      </w:pPr>
+      <w:r>
+        <w:t>ZX81EmulatorC.exe /d$080d,$ffd2 /s</w:t>
+      </w:r>
+    </w:p>
+    <w:p>
+      <w:r>
+        <w:rPr>
+          <w:b/>
+        </w:rPr>
+        <w:t xml:space="preserve">Consequence: </w:t>
+      </w:r>
+      <w:r>
+        <w:t>Execution stops when the CPU reaches any listed address, allowing later inspection or continuation.</w:t>
+      </w:r>
+    </w:p>
+    <w:p>
+      <w:pPr>
+        <w:pStyle w:val="Ttulo1"/>
+        <w:spacing w:before="280"/>
+      </w:pPr>
+      <w:bookmarkStart w:id="25" w:name="_Toc237362889"/>
+      <w:r>
+        <w:t>/s</w:t>
+      </w:r>
+      <w:bookmarkEnd w:id="25"/>
+    </w:p>
+    <w:p>
+      <w:r>
+        <w:rPr>
+          <w:b/>
+        </w:rPr>
+        <w:t xml:space="preserve">Meaning: </w:t>
+      </w:r>
+      <w:r>
+        <w:t>Controls whether the emulated computer starts stopped.</w:t>
+      </w:r>
+    </w:p>
+    <w:p>
+      <w:r>
+        <w:rPr>
+          <w:b/>
+        </w:rPr>
+        <w:t xml:space="preserve">General form: </w:t>
+      </w:r>
+    </w:p>
+    <w:p>
+      <w:pPr>
+        <w:pStyle w:val="Code"/>
+        <w:keepLines/>
+      </w:pPr>
+      <w:r>
+        <w:t>/s[YES|NO]</w:t>
       </w:r>
     </w:p>
     <w:p>
@@ -11985,7 +12001,7 @@
         </w:numPr>
       </w:pPr>
       <w:r>
-        <w:t>NO (and any non-YES non-empty value): start running.</w:t>
+        <w:t>YES or an empty value: start stopped.</w:t>
       </w:r>
     </w:p>
     <w:p>
@@ -11997,82 +12013,7 @@
         </w:numPr>
       </w:pPr>
       <w:r>
-        <w:t>Omitted: start running.</w:t>
-      </w:r>
-    </w:p>
-    <w:p>
-      <w:r>
-        <w:rPr>
-          <w:b/>
-        </w:rPr>
-        <w:t xml:space="preserve">Examples: </w:t>
-      </w:r>
-    </w:p>
-    <w:p>
-      <w:pPr>
-        <w:pStyle w:val="Code"/>
-        <w:keepLines/>
-      </w:pPr>
-      <w:r>
-        <w:t>ZX81EmulatorC.exe /s</w:t>
-      </w:r>
-    </w:p>
-    <w:p>
-      <w:pPr>
-        <w:pStyle w:val="Code"/>
-        <w:keepLines/>
-      </w:pPr>
-      <w:r>
-        <w:t>ZX81EmulatorC.exe /sNO</w:t>
-      </w:r>
-    </w:p>
-    <w:p>
-      <w:r>
-        <w:rPr>
-          <w:b/>
-        </w:rPr>
-        <w:t xml:space="preserve">Consequence: </w:t>
-      </w:r>
-      <w:r>
-        <w:t>When enabled, the machine is initialized but the CPU does not run until a RUN/NEXT command or the equivalent UI action is issued.</w:t>
-      </w:r>
-    </w:p>
-    <w:p>
-      <w:pPr>
-        <w:pStyle w:val="Ttulo1"/>
-        <w:spacing w:before="280"/>
-      </w:pPr>
-      <w:bookmarkStart w:id="26" w:name="_Toc237362890"/>
-      <w:r>
-        <w:t>/i</w:t>
-      </w:r>
-      <w:bookmarkEnd w:id="26"/>
-    </w:p>
-    <w:p>
-      <w:r>
-        <w:rPr>
-          <w:b/>
-        </w:rPr>
-        <w:t xml:space="preserve">Meaning: </w:t>
-      </w:r>
-      <w:r>
-        <w:t>Selects the language identifier exposed to the emulated machine.</w:t>
-      </w:r>
-    </w:p>
-    <w:p>
-      <w:r>
-        <w:rPr>
-          <w:b/>
-        </w:rPr>
-        <w:t xml:space="preserve">General form: </w:t>
-      </w:r>
-    </w:p>
-    <w:p>
-      <w:pPr>
-        <w:pStyle w:val="Code"/>
-      </w:pPr>
-      <w:r>
-        <w:t>/iLANG</w:t>
+        <w:t>NO (and any non-YES non-empty value): start running.</w:t>
       </w:r>
     </w:p>
     <w:p>
@@ -12084,7 +12025,7 @@
         </w:numPr>
       </w:pPr>
       <w:r>
-        <w:t>ENG: English; this is the only language advertised and supported by the ZX80/ZX81 emulator.</w:t>
+        <w:t>Omitted: start running.</w:t>
       </w:r>
     </w:p>
     <w:p>
@@ -12098,9 +12039,19 @@
     <w:p>
       <w:pPr>
         <w:pStyle w:val="Code"/>
-      </w:pPr>
-      <w:r>
-        <w:t>ZX81EmulatorC.exe /iENG</w:t>
+        <w:keepLines/>
+      </w:pPr>
+      <w:r>
+        <w:t>ZX81EmulatorC.exe /s</w:t>
+      </w:r>
+    </w:p>
+    <w:p>
+      <w:pPr>
+        <w:pStyle w:val="Code"/>
+        <w:keepLines/>
+      </w:pPr>
+      <w:r>
+        <w:t>ZX81EmulatorC.exe /sNO</w:t>
       </w:r>
     </w:p>
     <w:p>
@@ -12111,7 +12062,7 @@
         <w:t xml:space="preserve">Consequence: </w:t>
       </w:r>
       <w:r>
-        <w:t>The machine starts with the English language identifier. Other values are passed through but have no documented ZX80/ZX81 ROM variant in this implementation.</w:t>
+        <w:t>When enabled, the machine is initialized but the CPU does not run until a RUN/NEXT command or the equivalent UI action is issued.</w:t>
       </w:r>
     </w:p>
     <w:p>
@@ -12119,12 +12070,11 @@
         <w:pStyle w:val="Ttulo1"/>
         <w:spacing w:before="280"/>
       </w:pPr>
-      <w:bookmarkStart w:id="27" w:name="_Toc237362891"/>
-      <w:r>
-        <w:lastRenderedPageBreak/>
-        <w:t>/r</w:t>
-      </w:r>
-      <w:bookmarkEnd w:id="27"/>
+      <w:bookmarkStart w:id="26" w:name="_Toc237362890"/>
+      <w:r>
+        <w:t>/i</w:t>
+      </w:r>
+      <w:bookmarkEnd w:id="26"/>
     </w:p>
     <w:p>
       <w:r>
@@ -12134,7 +12084,7 @@
         <w:t xml:space="preserve">Meaning: </w:t>
       </w:r>
       <w:r>
-        <w:t>Requests the initial sound-output state.</w:t>
+        <w:t>Selects the language identifier exposed to the emulated machine.</w:t>
       </w:r>
     </w:p>
     <w:p>
@@ -12150,7 +12100,7 @@
         <w:pStyle w:val="Code"/>
       </w:pPr>
       <w:r>
-        <w:t>/r[YES|NO]</w:t>
+        <w:t>/iLANG</w:t>
       </w:r>
     </w:p>
     <w:p>
@@ -12162,7 +12112,73 @@
         </w:numPr>
       </w:pPr>
       <w:r>
-        <w:t>YES or an empty value: requests sound enabled.</w:t>
+        <w:t>ENG: English; this is the only language advertised and supported by the ZX80/ZX81 emulator.</w:t>
+      </w:r>
+    </w:p>
+    <w:p>
+      <w:r>
+        <w:rPr>
+          <w:b/>
+        </w:rPr>
+        <w:t xml:space="preserve">Examples: </w:t>
+      </w:r>
+    </w:p>
+    <w:p>
+      <w:pPr>
+        <w:pStyle w:val="Code"/>
+      </w:pPr>
+      <w:r>
+        <w:t>ZX81EmulatorC.exe /iENG</w:t>
+      </w:r>
+    </w:p>
+    <w:p>
+      <w:r>
+        <w:rPr>
+          <w:b/>
+        </w:rPr>
+        <w:t xml:space="preserve">Consequence: </w:t>
+      </w:r>
+      <w:r>
+        <w:t>The machine starts with the English language identifier. Other values are passed through but have no documented ZX80/ZX81 ROM variant in this implementation.</w:t>
+      </w:r>
+    </w:p>
+    <w:p>
+      <w:pPr>
+        <w:pStyle w:val="Ttulo1"/>
+        <w:spacing w:before="280"/>
+      </w:pPr>
+      <w:bookmarkStart w:id="27" w:name="_Toc237362891"/>
+      <w:r>
+        <w:lastRenderedPageBreak/>
+        <w:t>/r</w:t>
+      </w:r>
+      <w:bookmarkEnd w:id="27"/>
+    </w:p>
+    <w:p>
+      <w:r>
+        <w:rPr>
+          <w:b/>
+        </w:rPr>
+        <w:t xml:space="preserve">Meaning: </w:t>
+      </w:r>
+      <w:r>
+        <w:t>Requests the initial sound-output state.</w:t>
+      </w:r>
+    </w:p>
+    <w:p>
+      <w:r>
+        <w:rPr>
+          <w:b/>
+        </w:rPr>
+        <w:t xml:space="preserve">General form: </w:t>
+      </w:r>
+    </w:p>
+    <w:p>
+      <w:pPr>
+        <w:pStyle w:val="Code"/>
+      </w:pPr>
+      <w:r>
+        <w:t>/r[YES|NO]</w:t>
       </w:r>
     </w:p>
     <w:p>
@@ -12174,7 +12190,7 @@
         </w:numPr>
       </w:pPr>
       <w:r>
-        <w:t>NO (and any other non-YES non-empty value): requests sound disabled.</w:t>
+        <w:t>YES or an empty value: requests sound enabled.</w:t>
       </w:r>
     </w:p>
     <w:p>
@@ -12186,80 +12202,7 @@
         </w:numPr>
       </w:pPr>
       <w:r>
-        <w:t>Omitted: requests sound enabled.</w:t>
-      </w:r>
-    </w:p>
-    <w:p>
-      <w:r>
-        <w:rPr>
-          <w:b/>
-        </w:rPr>
-        <w:t xml:space="preserve">Examples: </w:t>
-      </w:r>
-    </w:p>
-    <w:p>
-      <w:pPr>
-        <w:pStyle w:val="Code"/>
-      </w:pPr>
-      <w:r>
-        <w:t>ZX81EmulatorC.exe /r</w:t>
-      </w:r>
-    </w:p>
-    <w:p>
-      <w:pPr>
-        <w:pStyle w:val="Code"/>
-      </w:pPr>
-      <w:r>
-        <w:t>ZX81EmulatorC.exe /rNO</w:t>
-      </w:r>
-    </w:p>
-    <w:p>
-      <w:r>
-        <w:rPr>
-          <w:b/>
-        </w:rPr>
-        <w:t xml:space="preserve">Consequence: </w:t>
-      </w:r>
-      <w:r>
-        <w:t>The option is parsed, but the implemented ZX80/ZX81 computer has no sound device, so initialization makes no audio-state change.</w:t>
-      </w:r>
-    </w:p>
-    <w:p>
-      <w:pPr>
-        <w:pStyle w:val="Ttulo1"/>
-        <w:spacing w:before="280"/>
-      </w:pPr>
-      <w:bookmarkStart w:id="28" w:name="_Toc237362892"/>
-      <w:r>
-        <w:t>/p</w:t>
-      </w:r>
-      <w:bookmarkEnd w:id="28"/>
-    </w:p>
-    <w:p>
-      <w:r>
-        <w:rPr>
-          <w:b/>
-        </w:rPr>
-        <w:t xml:space="preserve">Meaning: </w:t>
-      </w:r>
-      <w:r>
-        <w:t>Connects one or more peripherals during startup.</w:t>
-      </w:r>
-    </w:p>
-    <w:p>
-      <w:r>
-        <w:rPr>
-          <w:b/>
-        </w:rPr>
-        <w:t xml:space="preserve">General form: </w:t>
-      </w:r>
-    </w:p>
-    <w:p>
-      <w:pPr>
-        <w:pStyle w:val="Code"/>
-      </w:pPr>
-      <w:r>
-        <w:t>/pPER1[,PER2...]</w:t>
+        <w:t>NO (and any other non-YES non-empty value): requests sound disabled.</w:t>
       </w:r>
     </w:p>
     <w:p>
@@ -12271,7 +12214,80 @@
         </w:numPr>
       </w:pPr>
       <w:r>
-        <w:t>10: typewriter keyboard input.</w:t>
+        <w:t>Omitted: requests sound enabled.</w:t>
+      </w:r>
+    </w:p>
+    <w:p>
+      <w:r>
+        <w:rPr>
+          <w:b/>
+        </w:rPr>
+        <w:t xml:space="preserve">Examples: </w:t>
+      </w:r>
+    </w:p>
+    <w:p>
+      <w:pPr>
+        <w:pStyle w:val="Code"/>
+      </w:pPr>
+      <w:r>
+        <w:t>ZX81EmulatorC.exe /r</w:t>
+      </w:r>
+    </w:p>
+    <w:p>
+      <w:pPr>
+        <w:pStyle w:val="Code"/>
+      </w:pPr>
+      <w:r>
+        <w:t>ZX81EmulatorC.exe /rNO</w:t>
+      </w:r>
+    </w:p>
+    <w:p>
+      <w:r>
+        <w:rPr>
+          <w:b/>
+        </w:rPr>
+        <w:t xml:space="preserve">Consequence: </w:t>
+      </w:r>
+      <w:r>
+        <w:t>The option is parsed, but the implemented ZX80/ZX81 computer has no sound device, so initialization makes no audio-state change.</w:t>
+      </w:r>
+    </w:p>
+    <w:p>
+      <w:pPr>
+        <w:pStyle w:val="Ttulo1"/>
+        <w:spacing w:before="280"/>
+      </w:pPr>
+      <w:bookmarkStart w:id="28" w:name="_Toc237362892"/>
+      <w:r>
+        <w:t>/p</w:t>
+      </w:r>
+      <w:bookmarkEnd w:id="28"/>
+    </w:p>
+    <w:p>
+      <w:r>
+        <w:rPr>
+          <w:b/>
+        </w:rPr>
+        <w:t xml:space="preserve">Meaning: </w:t>
+      </w:r>
+      <w:r>
+        <w:t>Connects one or more peripherals during startup.</w:t>
+      </w:r>
+    </w:p>
+    <w:p>
+      <w:r>
+        <w:rPr>
+          <w:b/>
+        </w:rPr>
+        <w:t xml:space="preserve">General form: </w:t>
+      </w:r>
+    </w:p>
+    <w:p>
+      <w:pPr>
+        <w:pStyle w:val="Code"/>
+      </w:pPr>
+      <w:r>
+        <w:t>/pPER1[,PER2...]</w:t>
       </w:r>
     </w:p>
     <w:p>
@@ -12283,7 +12299,7 @@
         </w:numPr>
       </w:pPr>
       <w:r>
-        <w:t>100: Sinclair cassette signal simulation.</w:t>
+        <w:t>10: typewriter keyboard input.</w:t>
       </w:r>
     </w:p>
     <w:p>
@@ -12295,7 +12311,7 @@
         </w:numPr>
       </w:pPr>
       <w:r>
-        <w:t>101: ZX80/ZX81 cassette-data injection.</w:t>
+        <w:t>100: Sinclair cassette signal simulation.</w:t>
       </w:r>
     </w:p>
     <w:p>
@@ -12307,7 +12323,7 @@
         </w:numPr>
       </w:pPr>
       <w:r>
-        <w:t>102: ZX Printer thermal-printer simulation.</w:t>
+        <w:t>101: ZX80/ZX81 cassette-data injection.</w:t>
       </w:r>
     </w:p>
     <w:p>
@@ -12319,81 +12335,7 @@
         </w:numPr>
       </w:pPr>
       <w:r>
-        <w:t>201: cartridge implementation supported by the builder, although it is not listed by POSSIBLEPERS.</w:t>
-      </w:r>
-    </w:p>
-    <w:p>
-      <w:r>
-        <w:rPr>
-          <w:b/>
-        </w:rPr>
-        <w:t xml:space="preserve">Examples: </w:t>
-      </w:r>
-    </w:p>
-    <w:p>
-      <w:pPr>
-        <w:pStyle w:val="Code"/>
-      </w:pPr>
-      <w:r>
-        <w:t>ZX81EmulatorC.exe /p10</w:t>
-      </w:r>
-    </w:p>
-    <w:p>
-      <w:pPr>
-        <w:pStyle w:val="Code"/>
-      </w:pPr>
-      <w:r>
-        <w:t>ZX81EmulatorC.exe /p100,102</w:t>
-      </w:r>
-    </w:p>
-    <w:p>
-      <w:r>
-        <w:rPr>
-          <w:b/>
-        </w:rPr>
-        <w:t xml:space="preserve">Consequence: </w:t>
-      </w:r>
-      <w:r>
-        <w:t>Each requested peripheral is built and connected to the first compatible device during emulator initialization. Unsupported IDs are logged and initialization continues.</w:t>
-      </w:r>
-    </w:p>
-    <w:p>
-      <w:pPr>
-        <w:pStyle w:val="Ttulo1"/>
-        <w:spacing w:before="280"/>
-      </w:pPr>
-      <w:bookmarkStart w:id="29" w:name="_Toc237362893"/>
-      <w:r>
-        <w:t>/g</w:t>
-      </w:r>
-      <w:bookmarkEnd w:id="29"/>
-    </w:p>
-    <w:p>
-      <w:r>
-        <w:rPr>
-          <w:b/>
-        </w:rPr>
-        <w:t xml:space="preserve">Meaning: </w:t>
-      </w:r>
-      <w:r>
-        <w:t>Controls the CRT post-processing effect at startup.</w:t>
-      </w:r>
-    </w:p>
-    <w:p>
-      <w:r>
-        <w:rPr>
-          <w:b/>
-        </w:rPr>
-        <w:t xml:space="preserve">General form: </w:t>
-      </w:r>
-    </w:p>
-    <w:p>
-      <w:pPr>
-        <w:pStyle w:val="Code"/>
-        <w:keepLines/>
-      </w:pPr>
-      <w:r>
-        <w:t>/g[YES|NO]</w:t>
+        <w:t>102: ZX Printer thermal-printer simulation.</w:t>
       </w:r>
     </w:p>
     <w:p>
@@ -12405,7 +12347,81 @@
         </w:numPr>
       </w:pPr>
       <w:r>
-        <w:t>YES or an empty value: CRT effect enabled.</w:t>
+        <w:t>201: cartridge implementation supported by the builder, although it is not listed by POSSIBLEPERS.</w:t>
+      </w:r>
+    </w:p>
+    <w:p>
+      <w:r>
+        <w:rPr>
+          <w:b/>
+        </w:rPr>
+        <w:t xml:space="preserve">Examples: </w:t>
+      </w:r>
+    </w:p>
+    <w:p>
+      <w:pPr>
+        <w:pStyle w:val="Code"/>
+      </w:pPr>
+      <w:r>
+        <w:t>ZX81EmulatorC.exe /p10</w:t>
+      </w:r>
+    </w:p>
+    <w:p>
+      <w:pPr>
+        <w:pStyle w:val="Code"/>
+      </w:pPr>
+      <w:r>
+        <w:t>ZX81EmulatorC.exe /p100,102</w:t>
+      </w:r>
+    </w:p>
+    <w:p>
+      <w:r>
+        <w:rPr>
+          <w:b/>
+        </w:rPr>
+        <w:t xml:space="preserve">Consequence: </w:t>
+      </w:r>
+      <w:r>
+        <w:t>Each requested peripheral is built and connected to the first compatible device during emulator initialization. Unsupported IDs are logged and initialization continues.</w:t>
+      </w:r>
+    </w:p>
+    <w:p>
+      <w:pPr>
+        <w:pStyle w:val="Ttulo1"/>
+        <w:spacing w:before="280"/>
+      </w:pPr>
+      <w:bookmarkStart w:id="29" w:name="_Toc237362893"/>
+      <w:r>
+        <w:t>/g</w:t>
+      </w:r>
+      <w:bookmarkEnd w:id="29"/>
+    </w:p>
+    <w:p>
+      <w:r>
+        <w:rPr>
+          <w:b/>
+        </w:rPr>
+        <w:t xml:space="preserve">Meaning: </w:t>
+      </w:r>
+      <w:r>
+        <w:t>Controls the CRT post-processing effect at startup.</w:t>
+      </w:r>
+    </w:p>
+    <w:p>
+      <w:r>
+        <w:rPr>
+          <w:b/>
+        </w:rPr>
+        <w:t xml:space="preserve">General form: </w:t>
+      </w:r>
+    </w:p>
+    <w:p>
+      <w:pPr>
+        <w:pStyle w:val="Code"/>
+        <w:keepLines/>
+      </w:pPr>
+      <w:r>
+        <w:t>/g[YES|NO]</w:t>
       </w:r>
     </w:p>
     <w:p>
@@ -12417,7 +12433,7 @@
         </w:numPr>
       </w:pPr>
       <w:r>
-        <w:t>NO (and any non-YES non-empty value): disabled.</w:t>
+        <w:t>YES or an empty value: CRT effect enabled.</w:t>
       </w:r>
     </w:p>
     <w:p>
@@ -12429,83 +12445,7 @@
         </w:numPr>
       </w:pPr>
       <w:r>
-        <w:t>Omitted: disabled.</w:t>
-      </w:r>
-    </w:p>
-    <w:p>
-      <w:r>
-        <w:rPr>
-          <w:b/>
-        </w:rPr>
-        <w:t xml:space="preserve">Examples: </w:t>
-      </w:r>
-    </w:p>
-    <w:p>
-      <w:pPr>
-        <w:pStyle w:val="Code"/>
-        <w:keepLines/>
-      </w:pPr>
-      <w:r>
-        <w:t>ZX81EmulatorC.exe /g</w:t>
-      </w:r>
-    </w:p>
-    <w:p>
-      <w:pPr>
-        <w:pStyle w:val="Code"/>
-        <w:keepLines/>
-      </w:pPr>
-      <w:r>
-        <w:t>ZX81EmulatorC.exe /gNO</w:t>
-      </w:r>
-    </w:p>
-    <w:p>
-      <w:r>
-        <w:rPr>
-          <w:b/>
-        </w:rPr>
-        <w:lastRenderedPageBreak/>
-        <w:t xml:space="preserve">Consequence: </w:t>
-      </w:r>
-      <w:r>
-        <w:t>The screen starts with or without CRT emulation. CRTON and CRTOFF can change it later.</w:t>
-      </w:r>
-    </w:p>
-    <w:p>
-      <w:pPr>
-        <w:pStyle w:val="Ttulo1"/>
-        <w:spacing w:before="280"/>
-      </w:pPr>
-      <w:bookmarkStart w:id="30" w:name="_Toc237362894"/>
-      <w:r>
-        <w:t>/n</w:t>
-      </w:r>
-      <w:bookmarkEnd w:id="30"/>
-    </w:p>
-    <w:p>
-      <w:r>
-        <w:rPr>
-          <w:b/>
-        </w:rPr>
-        <w:t xml:space="preserve">Meaning: </w:t>
-      </w:r>
-      <w:r>
-        <w:t>Requests NTSC visualization parameters.</w:t>
-      </w:r>
-    </w:p>
-    <w:p>
-      <w:r>
-        <w:rPr>
-          <w:b/>
-        </w:rPr>
-        <w:t xml:space="preserve">General form: </w:t>
-      </w:r>
-    </w:p>
-    <w:p>
-      <w:pPr>
-        <w:pStyle w:val="Code"/>
-      </w:pPr>
-      <w:r>
-        <w:t>/n</w:t>
+        <w:t>NO (and any non-YES non-empty value): disabled.</w:t>
       </w:r>
     </w:p>
     <w:p>
@@ -12517,7 +12457,7 @@
         </w:numPr>
       </w:pPr>
       <w:r>
-        <w:t>No value: the presence of the option requests NTSC.</w:t>
+        <w:t>Omitted: disabled.</w:t>
       </w:r>
     </w:p>
     <w:p>
@@ -12531,20 +12471,31 @@
     <w:p>
       <w:pPr>
         <w:pStyle w:val="Code"/>
-      </w:pPr>
-      <w:r>
-        <w:t>ZX81EmulatorC.exe /mZX813 /n</w:t>
-      </w:r>
-    </w:p>
-    <w:p>
-      <w:r>
-        <w:rPr>
-          <w:b/>
-        </w:rPr>
+        <w:keepLines/>
+      </w:pPr>
+      <w:r>
+        <w:t>ZX81EmulatorC.exe /g</w:t>
+      </w:r>
+    </w:p>
+    <w:p>
+      <w:pPr>
+        <w:pStyle w:val="Code"/>
+        <w:keepLines/>
+      </w:pPr>
+      <w:r>
+        <w:t>ZX81EmulatorC.exe /gNO</w:t>
+      </w:r>
+    </w:p>
+    <w:p>
+      <w:r>
+        <w:rPr>
+          <w:b/>
+        </w:rPr>
+        <w:lastRenderedPageBreak/>
         <w:t xml:space="preserve">Consequence: </w:t>
       </w:r>
       <w:r>
-        <w:t>The current factory always constructs PAL ZX80 and ZX81 machines. The option is detected and a limitation is written to the log, but PAL timing and screen geometry remain active.</w:t>
+        <w:t>The screen starts with or without CRT emulation. CRTON and CRTOFF can change it later.</w:t>
       </w:r>
     </w:p>
     <w:p>
@@ -12552,11 +12503,11 @@
         <w:pStyle w:val="Ttulo1"/>
         <w:spacing w:before="280"/>
       </w:pPr>
-      <w:bookmarkStart w:id="31" w:name="_Toc237362895"/>
-      <w:r>
-        <w:t>/w</w:t>
-      </w:r>
-      <w:bookmarkEnd w:id="31"/>
+      <w:bookmarkStart w:id="30" w:name="_Toc237362894"/>
+      <w:r>
+        <w:t>/n</w:t>
+      </w:r>
+      <w:bookmarkEnd w:id="30"/>
     </w:p>
     <w:p>
       <w:r>
@@ -12566,7 +12517,7 @@
         <w:t xml:space="preserve">Meaning: </w:t>
       </w:r>
       <w:r>
-        <w:t>Selects the startup RAM configuration.</w:t>
+        <w:t>Requests NTSC visualization parameters.</w:t>
       </w:r>
     </w:p>
     <w:p>
@@ -12582,7 +12533,7 @@
         <w:pStyle w:val="Code"/>
       </w:pPr>
       <w:r>
-        <w:t>/wCONF</w:t>
+        <w:t>/n</w:t>
       </w:r>
     </w:p>
     <w:p>
@@ -12594,7 +12545,72 @@
         </w:numPr>
       </w:pPr>
       <w:r>
-        <w:t>ZX80: only configuration 0 (unexpanded) is implemented; another value is ignored and logged.</w:t>
+        <w:t>No value: the presence of the option requests NTSC.</w:t>
+      </w:r>
+    </w:p>
+    <w:p>
+      <w:r>
+        <w:rPr>
+          <w:b/>
+        </w:rPr>
+        <w:t xml:space="preserve">Examples: </w:t>
+      </w:r>
+    </w:p>
+    <w:p>
+      <w:pPr>
+        <w:pStyle w:val="Code"/>
+      </w:pPr>
+      <w:r>
+        <w:t>ZX81EmulatorC.exe /mZX813 /n</w:t>
+      </w:r>
+    </w:p>
+    <w:p>
+      <w:r>
+        <w:rPr>
+          <w:b/>
+        </w:rPr>
+        <w:t xml:space="preserve">Consequence: </w:t>
+      </w:r>
+      <w:r>
+        <w:t>The current factory always constructs PAL ZX80 and ZX81 machines. The option is detected and a limitation is written to the log, but PAL timing and screen geometry remain active.</w:t>
+      </w:r>
+    </w:p>
+    <w:p>
+      <w:pPr>
+        <w:pStyle w:val="Ttulo1"/>
+        <w:spacing w:before="280"/>
+      </w:pPr>
+      <w:bookmarkStart w:id="31" w:name="_Toc237362895"/>
+      <w:r>
+        <w:t>/w</w:t>
+      </w:r>
+      <w:bookmarkEnd w:id="31"/>
+    </w:p>
+    <w:p>
+      <w:r>
+        <w:rPr>
+          <w:b/>
+        </w:rPr>
+        <w:t xml:space="preserve">Meaning: </w:t>
+      </w:r>
+      <w:r>
+        <w:t>Selects the startup RAM configuration.</w:t>
+      </w:r>
+    </w:p>
+    <w:p>
+      <w:r>
+        <w:rPr>
+          <w:b/>
+        </w:rPr>
+        <w:t xml:space="preserve">General form: </w:t>
+      </w:r>
+    </w:p>
+    <w:p>
+      <w:pPr>
+        <w:pStyle w:val="Code"/>
+      </w:pPr>
+      <w:r>
+        <w:t>/wCONF</w:t>
       </w:r>
     </w:p>
     <w:p>
@@ -12606,7 +12622,7 @@
         </w:numPr>
       </w:pPr>
       <w:r>
-        <w:t>ZX81 ROM variants, 0 or omitted: unexpanded configuration (default).</w:t>
+        <w:t>ZX80: only configuration 0 (unexpanded) is implemented; another value is ignored and logged.</w:t>
       </w:r>
     </w:p>
     <w:p>
@@ -12618,7 +12634,7 @@
         </w:numPr>
       </w:pPr>
       <w:r>
-        <w:t>ZX81 ROM variants, 1: 16 KiB expansion.</w:t>
+        <w:t>ZX81 ROM variants, 0 or omitted: unexpanded configuration (default).</w:t>
       </w:r>
     </w:p>
     <w:p>
@@ -12630,80 +12646,7 @@
         </w:numPr>
       </w:pPr>
       <w:r>
-        <w:t>ZX81 ROM variants, any value other than 0 or 1: reset to unexpanded configuration and logged.</w:t>
-      </w:r>
-    </w:p>
-    <w:p>
-      <w:r>
-        <w:rPr>
-          <w:b/>
-        </w:rPr>
-        <w:t xml:space="preserve">Examples: </w:t>
-      </w:r>
-    </w:p>
-    <w:p>
-      <w:pPr>
-        <w:pStyle w:val="Code"/>
-      </w:pPr>
-      <w:r>
-        <w:t>ZX81EmulatorC.exe /mZX80 /w0</w:t>
-      </w:r>
-    </w:p>
-    <w:p>
-      <w:pPr>
-        <w:pStyle w:val="Code"/>
-      </w:pPr>
-      <w:r>
-        <w:t>ZX81EmulatorC.exe /mZX813 /w1</w:t>
-      </w:r>
-    </w:p>
-    <w:p>
-      <w:r>
-        <w:rPr>
-          <w:b/>
-        </w:rPr>
-        <w:t xml:space="preserve">Consequence: </w:t>
-      </w:r>
-      <w:r>
-        <w:t>The selected memory map is installed before the ROM and machine initialize. The broader 3K/8K/24K list in an old header comment is not implemented by the current factory.</w:t>
-      </w:r>
-    </w:p>
-    <w:p>
-      <w:pPr>
-        <w:pStyle w:val="Ttulo1"/>
-        <w:spacing w:before="280"/>
-      </w:pPr>
-      <w:bookmarkStart w:id="32" w:name="_Toc237362896"/>
-      <w:r>
-        <w:t>/b</w:t>
-      </w:r>
-      <w:bookmarkEnd w:id="32"/>
-    </w:p>
-    <w:p>
-      <w:r>
-        <w:rPr>
-          <w:b/>
-        </w:rPr>
-        <w:t xml:space="preserve">Meaning: </w:t>
-      </w:r>
-      <w:r>
-        <w:t>Draws a diagnostic grid around the writable screen area and selects its color.</w:t>
-      </w:r>
-    </w:p>
-    <w:p>
-      <w:r>
-        <w:rPr>
-          <w:b/>
-        </w:rPr>
-        <w:t xml:space="preserve">General form: </w:t>
-      </w:r>
-    </w:p>
-    <w:p>
-      <w:pPr>
-        <w:pStyle w:val="Code"/>
-      </w:pPr>
-      <w:r>
-        <w:t>/b[COLOR]</w:t>
+        <w:t>ZX81 ROM variants, 1: 16 KiB expansion.</w:t>
       </w:r>
     </w:p>
     <w:p>
@@ -12715,7 +12658,7 @@
         </w:numPr>
       </w:pPr>
       <w:r>
-        <w:t>COLOR omitted or 0: black (default).</w:t>
+        <w:t>ZX81 ROM variants, 2: 16 KiB expansion with refresh-read capability for WRX. Pattern loads use the captured I:R address when it selects the active expansion or its ULA-view mirror. Other addresses retain the existing character path; an undriven refresh bus is not modeled. Full WRX program compatibility remains to be verified.</w:t>
       </w:r>
     </w:p>
     <w:p>
@@ -12727,7 +12670,88 @@
         </w:numPr>
       </w:pPr>
       <w:r>
-        <w:t>1 through 15: the requested grid color.</w:t>
+        <w:t>ZX81 ROM variants, any value other than 0, 1 or 2: reset to unexpanded configuration and logged.</w:t>
+      </w:r>
+    </w:p>
+    <w:p>
+      <w:r>
+        <w:rPr>
+          <w:b/>
+        </w:rPr>
+        <w:t xml:space="preserve">Examples: </w:t>
+      </w:r>
+    </w:p>
+    <w:p>
+      <w:pPr>
+        <w:pStyle w:val="Code"/>
+      </w:pPr>
+      <w:r>
+        <w:t>ZX81EmulatorC.exe /mZX80 /w0</w:t>
+      </w:r>
+    </w:p>
+    <w:p>
+      <w:pPr>
+        <w:pStyle w:val="Code"/>
+      </w:pPr>
+      <w:r>
+        <w:t>ZX81EmulatorC.exe /mZX813 /w1</w:t>
+      </w:r>
+    </w:p>
+    <w:p>
+      <w:pPr>
+        <w:pStyle w:val="Code"/>
+      </w:pPr>
+      <w:r>
+        <w:t>ZX81EmulatorC.exe /mZX813 /w2</w:t>
+      </w:r>
+    </w:p>
+    <w:p>
+      <w:r>
+        <w:rPr>
+          <w:b/>
+        </w:rPr>
+        <w:t xml:space="preserve">Consequence: </w:t>
+      </w:r>
+      <w:r>
+        <w:t>The selected memory map is installed before the ROM and machine initialize. The broader 3K/8K/24K list in an old header comment is not implemented by the current factory.</w:t>
+      </w:r>
+    </w:p>
+    <w:p>
+      <w:pPr>
+        <w:pStyle w:val="Ttulo1"/>
+        <w:spacing w:before="280"/>
+      </w:pPr>
+      <w:bookmarkStart w:id="32" w:name="_Toc237362896"/>
+      <w:r>
+        <w:t>/b</w:t>
+      </w:r>
+      <w:bookmarkEnd w:id="32"/>
+    </w:p>
+    <w:p>
+      <w:r>
+        <w:rPr>
+          <w:b/>
+        </w:rPr>
+        <w:t xml:space="preserve">Meaning: </w:t>
+      </w:r>
+      <w:r>
+        <w:t>Draws a diagnostic grid around the writable screen area and selects its color.</w:t>
+      </w:r>
+    </w:p>
+    <w:p>
+      <w:r>
+        <w:rPr>
+          <w:b/>
+        </w:rPr>
+        <w:t xml:space="preserve">General form: </w:t>
+      </w:r>
+    </w:p>
+    <w:p>
+      <w:pPr>
+        <w:pStyle w:val="Code"/>
+      </w:pPr>
+      <w:r>
+        <w:t>/b[COLOR]</w:t>
       </w:r>
     </w:p>
     <w:p>
@@ -12739,81 +12763,7 @@
         </w:numPr>
       </w:pPr>
       <w:r>
-        <w:t>Any value greater than 15: clamped to 15.</w:t>
-      </w:r>
-    </w:p>
-    <w:p>
-      <w:r>
-        <w:rPr>
-          <w:b/>
-        </w:rPr>
-        <w:t xml:space="preserve">Examples: </w:t>
-      </w:r>
-    </w:p>
-    <w:p>
-      <w:pPr>
-        <w:pStyle w:val="Code"/>
-      </w:pPr>
-      <w:r>
-        <w:t>ZX81EmulatorC.exe /b</w:t>
-      </w:r>
-    </w:p>
-    <w:p>
-      <w:pPr>
-        <w:pStyle w:val="Code"/>
-      </w:pPr>
-      <w:r>
-        <w:t>ZX81EmulatorC.exe /b14</w:t>
-      </w:r>
-    </w:p>
-    <w:p>
-      <w:r>
-        <w:rPr>
-          <w:b/>
-        </w:rPr>
-        <w:lastRenderedPageBreak/>
-        <w:t xml:space="preserve">Consequence: </w:t>
-      </w:r>
-      <w:r>
-        <w:t>The screen is initialized with the diagnostic grid enabled in the selected color.</w:t>
-      </w:r>
-    </w:p>
-    <w:p>
-      <w:pPr>
-        <w:pStyle w:val="Ttulo1"/>
-        <w:spacing w:before="280"/>
-      </w:pPr>
-      <w:bookmarkStart w:id="33" w:name="_Toc237362897"/>
-      <w:r>
-        <w:t>/m</w:t>
-      </w:r>
-      <w:bookmarkEnd w:id="33"/>
-    </w:p>
-    <w:p>
-      <w:r>
-        <w:rPr>
-          <w:b/>
-        </w:rPr>
-        <w:t xml:space="preserve">Meaning: </w:t>
-      </w:r>
-      <w:r>
-        <w:t>Selects the ZX80 or ZX81 ROM variant to emulate.</w:t>
-      </w:r>
-    </w:p>
-    <w:p>
-      <w:r>
-        <w:rPr>
-          <w:b/>
-        </w:rPr>
-        <w:t xml:space="preserve">General form: </w:t>
-      </w:r>
-    </w:p>
-    <w:p>
-      <w:pPr>
-        <w:pStyle w:val="Code"/>
-      </w:pPr>
-      <w:r>
-        <w:t>/mMACHINE</w:t>
+        <w:t>COLOR omitted or 0: black (default).</w:t>
       </w:r>
     </w:p>
     <w:p>
@@ -12825,7 +12775,7 @@
         </w:numPr>
       </w:pPr>
       <w:r>
-        <w:t>ZX80: ZX80 model and ROM; this is the default when /m is omitted.</w:t>
+        <w:t>1 through 15: the requested grid color.</w:t>
       </w:r>
     </w:p>
     <w:p>
@@ -12837,7 +12787,81 @@
         </w:numPr>
       </w:pPr>
       <w:r>
-        <w:t>ZX811: ZX81 with the old ROM image.</w:t>
+        <w:t>Any value greater than 15: clamped to 15.</w:t>
+      </w:r>
+    </w:p>
+    <w:p>
+      <w:r>
+        <w:rPr>
+          <w:b/>
+        </w:rPr>
+        <w:t xml:space="preserve">Examples: </w:t>
+      </w:r>
+    </w:p>
+    <w:p>
+      <w:pPr>
+        <w:pStyle w:val="Code"/>
+      </w:pPr>
+      <w:r>
+        <w:t>ZX81EmulatorC.exe /b</w:t>
+      </w:r>
+    </w:p>
+    <w:p>
+      <w:pPr>
+        <w:pStyle w:val="Code"/>
+      </w:pPr>
+      <w:r>
+        <w:t>ZX81EmulatorC.exe /b14</w:t>
+      </w:r>
+    </w:p>
+    <w:p>
+      <w:r>
+        <w:rPr>
+          <w:b/>
+        </w:rPr>
+        <w:lastRenderedPageBreak/>
+        <w:t xml:space="preserve">Consequence: </w:t>
+      </w:r>
+      <w:r>
+        <w:t>The screen is initialized with the diagnostic grid enabled in the selected color.</w:t>
+      </w:r>
+    </w:p>
+    <w:p>
+      <w:pPr>
+        <w:pStyle w:val="Ttulo1"/>
+        <w:spacing w:before="280"/>
+      </w:pPr>
+      <w:bookmarkStart w:id="33" w:name="_Toc237362897"/>
+      <w:r>
+        <w:t>/m</w:t>
+      </w:r>
+      <w:bookmarkEnd w:id="33"/>
+    </w:p>
+    <w:p>
+      <w:r>
+        <w:rPr>
+          <w:b/>
+        </w:rPr>
+        <w:t xml:space="preserve">Meaning: </w:t>
+      </w:r>
+      <w:r>
+        <w:t>Selects the ZX80 or ZX81 ROM variant to emulate.</w:t>
+      </w:r>
+    </w:p>
+    <w:p>
+      <w:r>
+        <w:rPr>
+          <w:b/>
+        </w:rPr>
+        <w:t xml:space="preserve">General form: </w:t>
+      </w:r>
+    </w:p>
+    <w:p>
+      <w:pPr>
+        <w:pStyle w:val="Code"/>
+      </w:pPr>
+      <w:r>
+        <w:t>/mMACHINE</w:t>
       </w:r>
     </w:p>
     <w:p>
@@ -12849,7 +12873,7 @@
         </w:numPr>
       </w:pPr>
       <w:r>
-        <w:t>ZX812: ZX81 with the rare/intermediate ROM image.</w:t>
+        <w:t>ZX80: ZX80 model and ROM; this is the default when /m is omitted.</w:t>
       </w:r>
     </w:p>
     <w:p>
@@ -12861,7 +12885,7 @@
         </w:numPr>
       </w:pPr>
       <w:r>
-        <w:t>ZX813: ZX81 with the newest ROM image.</w:t>
+        <w:t>ZX811: ZX81 with the old ROM image.</w:t>
       </w:r>
     </w:p>
     <w:p>
@@ -12873,6 +12897,30 @@
         </w:numPr>
       </w:pPr>
       <w:r>
+        <w:t>ZX812: ZX81 with the rare/intermediate ROM image.</w:t>
+      </w:r>
+    </w:p>
+    <w:p>
+      <w:pPr>
+        <w:pStyle w:val="Prrafodelista"/>
+        <w:numPr>
+          <w:ilvl w:val="0"/>
+          <w:numId w:val="12"/>
+        </w:numPr>
+      </w:pPr>
+      <w:r>
+        <w:t>ZX813: ZX81 with the newest ROM image.</w:t>
+      </w:r>
+    </w:p>
+    <w:p>
+      <w:pPr>
+        <w:pStyle w:val="Prrafodelista"/>
+        <w:numPr>
+          <w:ilvl w:val="0"/>
+          <w:numId w:val="12"/>
+        </w:numPr>
+      </w:pPr>
+      <w:r>
         <w:t>Any other value: logs the unsupported selector and falls back to ZX80.</w:t>
       </w:r>
     </w:p>
@@ -12906,6 +12954,14 @@
       </w:pPr>
       <w:r>
         <w:t>ZX81EmulatorC.exe /mZX813 /w1</w:t>
+      </w:r>
+    </w:p>
+    <w:p>
+      <w:pPr>
+        <w:pStyle w:val="Code"/>
+      </w:pPr>
+      <w:r>
+        <w:t>ZX81EmulatorC.exe /mZX813 /w2</w:t>
       </w:r>
     </w:p>
     <w:p>

</xml_diff>